<commit_message>
Canonの検討対象をGUARDIANWALLからOutbound Security for Microsoft 365に修正
比較表・比較検討結果・概算費用を、Microsoft 365専用のOutlookアドイン
「Outbound Security for Microsoft 365」（月額100円～/ユーザー）の
実際の仕様・価格に合わせて修正。

Co-Authored-By: Claude Sonnet 5 <noreply@anthropic.com>
Claude-Session: https://claude.ai/code/session_01QMDExq5C5P6m683h1ae6G3
</commit_message>
<xml_diff>
--- a/docs/メール誤送信防止・脱PPAP対策_導入企画書_骨子.docx
+++ b/docs/メール誤送信防止・脱PPAP対策_導入企画書_骨子.docx
@@ -426,7 +426,7 @@
                 <w:szCs w:val="19"/>
               </w:rPr>
               <w:t xml:space="preserve">Canon
-(GUARDIANWALL)</w:t>
+(Outbound Security for Microsoft 365)</w:t>
             </w:r>
           </w:p>
         </w:tc>
@@ -568,7 +568,7 @@
                 <w:sz w:val="19"/>
                 <w:szCs w:val="19"/>
               </w:rPr>
-              <w:t xml:space="preserve">キヤノンマーケティングジャパン株式会社</w:t>
+              <w:t xml:space="preserve">キヤノンITソリューションズ株式会社</w:t>
             </w:r>
           </w:p>
         </w:tc>
@@ -679,7 +679,7 @@
                 <w:sz w:val="19"/>
                 <w:szCs w:val="19"/>
               </w:rPr>
-              <w:t xml:space="preserve">クラウド（メールフィルタリング＋オプション連携）</w:t>
+              <w:t xml:space="preserve">クラウド（メールフィルタリング＋オプション連携、メール環境を問わず利用可）</w:t>
             </w:r>
           </w:p>
         </w:tc>
@@ -707,7 +707,7 @@
                 <w:sz w:val="19"/>
                 <w:szCs w:val="19"/>
               </w:rPr>
-              <w:t xml:space="preserve">クラウド（GUARDIANWALL Mailセキュリティ・クラウド）</w:t>
+              <w:t xml:space="preserve">SaaS（Microsoft 365専用のOutlookアドイン型。管理者がM365管理センターで登録するだけで全ユーザーに適用、利用者側の設定不要）</w:t>
             </w:r>
           </w:p>
         </w:tc>
@@ -846,7 +846,7 @@
                 <w:sz w:val="19"/>
                 <w:szCs w:val="19"/>
               </w:rPr>
-              <w:t xml:space="preserve">送信一時保留、送信前再確認、上長承認によるダブルチェック</w:t>
+              <w:t xml:space="preserve">送信前確認ポップアップ（宛先・本文・添付ファイルの確認）、宛先の自動BCC変換</w:t>
             </w:r>
           </w:p>
         </w:tc>
@@ -989,7 +989,7 @@
                 <w:szCs w:val="19"/>
               </w:rPr>
               <w:t xml:space="preserve">○
-「MailConvert」が添付ファイルを自動分離しDLリンク化。誤送信時はリンク無効化で漏えい遮断</w:t>
+添付ファイルを自動でダウンロードリンク化。誤送信時はダウンロードサイト側でファイルを非公開化でき漏えいを防止、ダウンロード履歴も確認可能</w:t>
             </w:r>
           </w:p>
         </w:tc>
@@ -1131,8 +1131,8 @@
                 <w:sz w:val="19"/>
                 <w:szCs w:val="19"/>
               </w:rPr>
-              <w:t xml:space="preserve">月額 300～400円／ユーザー
-（Basic／Premiumで機能と価格を選択可、MailFilter＋MailConvert合算）</w:t>
+              <w:t xml:space="preserve">月額 100円～／ユーザー
+（誤送信防止＋脱PPAPが1アドインに統合、初期費用0円、10ユーザー以上・年間契約）</w:t>
             </w:r>
           </w:p>
         </w:tc>
@@ -1271,7 +1271,7 @@
                 <w:sz w:val="19"/>
                 <w:szCs w:val="19"/>
               </w:rPr>
-              <w:t xml:space="preserve">複合機・事務機販売網を活かした全国的な導入・保守サポート体制</w:t>
+              <w:t xml:space="preserve">複合機・事務機販売網を持つキヤノングループの全国的な導入・保守サポート体制</w:t>
             </w:r>
           </w:p>
         </w:tc>
@@ -1410,7 +1410,7 @@
                 <w:sz w:val="19"/>
                 <w:szCs w:val="19"/>
               </w:rPr>
-              <w:t xml:space="preserve">誤送信防止・脱PPAPを1社で完結しつつ価格は競争力あり。価格と機能のバランスが良い</w:t>
+              <w:t xml:space="preserve">誤送信防止・脱PPAPを1つのアドインで完結しつつ、月額単価は3社中最も低い。価格と機能のバランスが良い</w:t>
             </w:r>
           </w:p>
         </w:tc>
@@ -1487,7 +1487,7 @@
           <w:sz w:val="21"/>
           <w:szCs w:val="21"/>
         </w:rPr>
-        <w:t xml:space="preserve">上記比較の結果、導入サービスとしてCanon（GUARDIANWALL Mailセキュリティ・クラウド）を推奨する。理由は以下のとおりである。</w:t>
+        <w:t xml:space="preserve">上記比較の結果、導入サービスとしてCanon（Outbound Security for Microsoft 365）を推奨する。理由は以下のとおりである。</w:t>
       </w:r>
     </w:p>
     <w:p>
@@ -1504,7 +1504,7 @@
           <w:sz w:val="24"/>
           <w:szCs w:val="24"/>
         </w:rPr>
-        <w:t xml:space="preserve">(1) 誤送信防止と脱PPAPを1社で過不足なくカバー</w:t>
+        <w:t xml:space="preserve">(1) 誤送信防止と脱PPAPを1つのアドインで過不足なくカバー</w:t>
       </w:r>
     </w:p>
     <w:p>
@@ -1517,7 +1517,7 @@
           <w:sz w:val="21"/>
           <w:szCs w:val="21"/>
         </w:rPr>
-        <w:t xml:space="preserve">Canonの「MailFilter on Cloud」による送信一時保留・上長承認等の誤送信防止機能と、「MailConvert on Cloud」による添付ファイルの自動ダウンロードリンク化（脱PPAP）を同一ベンダーの1サービスとして導入でき、ヘンゲと同様に機能不足なく現状の課題（誤送信・PPAP運用）を解消できる。現行の「おかん」で欠けている脱PPAP機能についても、誤送信時のリンク無効化により漏えいを遮断できる点で確実にカバーできる。</w:t>
+        <w:t xml:space="preserve">Canonの「Outbound Security for Microsoft 365」は、送信前確認ポップアップ・宛先自動BCC変換による誤送信防止機能と、添付ファイルの自動ダウンロードリンク化（脱PPAP）を、Microsoft 365専用の単一のOutlookアドインとして提供する。ヘンゲと同様に機能不足なく現状の課題（誤送信・PPAP運用）を解消でき、現行の「おかん」で欠けている脱PPAP機能についても、誤送信時のダウンロードサイト側でのファイル非公開化により漏えいを遮断できる点で確実にカバーできる。</w:t>
       </w:r>
     </w:p>
     <w:p>
@@ -1534,7 +1534,7 @@
           <w:sz w:val="24"/>
           <w:szCs w:val="24"/>
         </w:rPr>
-        <w:t xml:space="preserve">(2) 価格競争力とプラン選択の柔軟性</w:t>
+        <w:t xml:space="preserve">(2) 価格の優位性</w:t>
       </w:r>
     </w:p>
     <w:p>
@@ -1547,7 +1547,7 @@
           <w:sz w:val="21"/>
           <w:szCs w:val="21"/>
         </w:rPr>
-        <w:t xml:space="preserve">Basic／Premiumの2プランが料金・機能とともに明示されており、想定月額はBasicで300円／ユーザー、Premiumで400円／ユーザー程度となる。同等機能を持つヘンゲ（月額350円／ユーザー、機能固定の単一プラン）と比較して、Basicプランを選択すれば同等以上の機能をより低いコストで導入でき、必要に応じてPremiumへ引き上げる拡張性もある。</w:t>
+        <w:t xml:space="preserve">月額100円／ユーザー～という価格は、同様に誤送信防止と脱PPAPを1プランで提供するヘンゲ（月額350円／ユーザー）の3分の1以下であり、本体＋オプションの組み合わせが必要なデジタルアーツ（月額200円～／ユーザー）と比べても最も低コストである。初期費用も0円のため、稟議上の投資規模を小さく抑えられる。</w:t>
       </w:r>
     </w:p>
     <w:p>
@@ -1564,7 +1564,7 @@
           <w:sz w:val="24"/>
           <w:szCs w:val="24"/>
         </w:rPr>
-        <w:t xml:space="preserve">(3) 契約構成のわかりやすさ</w:t>
+        <w:t xml:space="preserve">(3) 導入・運用の手軽さ</w:t>
       </w:r>
     </w:p>
     <w:p>
@@ -1577,7 +1577,7 @@
           <w:sz w:val="21"/>
           <w:szCs w:val="21"/>
         </w:rPr>
-        <w:t xml:space="preserve">デジタルアーツはメールフィルタ本体とf-FILTERオプションの組み合わせで契約する必要があり、総額が個別見積り中心でわかりにくい面がある。Canonは誤送信防止（MailFilter）と脱PPAP（MailConvert）がいずれも公開の月額単価で提示されており、稟議段階での費用試算・説明がしやすい。</w:t>
+        <w:t xml:space="preserve">管理者がMicrosoft 365管理センター上で登録するだけで全ユーザーに適用され、利用者側での個別設定が不要なため、展開までのリードタイムが短く運用負荷も小さい。当社は既にMicrosoft 365ライセンスを保有し、メール運用もMicrosoft 365上で行っているため、本サービスがMicrosoft 365専用であることは実質的な制約にならない。</w:t>
       </w:r>
     </w:p>
     <w:p>
@@ -1622,7 +1622,7 @@
           <w:sz w:val="21"/>
           <w:szCs w:val="21"/>
         </w:rPr>
-        <w:t xml:space="preserve">以上より、Canonは「価格と機能のバランスが良い」サービスであり、誤送信防止・脱PPAPという2つの課題を、コストを抑えつつ確実に解決できる最適な選択肢と考える。</w:t>
+        <w:t xml:space="preserve">以上より、Canonは「価格と機能のバランスが良い」サービスであり、誤送信防止・脱PPAPという2つの課題を、最も低いコストで確実に解決できる選択肢と考える。</w:t>
       </w:r>
     </w:p>
     <w:p>
@@ -1819,8 +1819,8 @@
                 <w:sz w:val="19"/>
                 <w:szCs w:val="19"/>
               </w:rPr>
-              <w:t xml:space="preserve">Canon GUARDIANWALL
-Mailセキュリティ・クラウド（Basicプラン）</w:t>
+              <w:t xml:space="preserve">Canon
+Outbound Security for Microsoft 365</w:t>
             </w:r>
           </w:p>
         </w:tc>
@@ -1847,7 +1847,7 @@
                 <w:sz w:val="19"/>
                 <w:szCs w:val="19"/>
               </w:rPr>
-              <w:t xml:space="preserve">300円／ユーザー・月</w:t>
+              <w:t xml:space="preserve">100円～／ユーザー・月</w:t>
             </w:r>
           </w:p>
         </w:tc>
@@ -1901,8 +1901,8 @@
                 <w:sz w:val="19"/>
                 <w:szCs w:val="19"/>
               </w:rPr>
-              <w:t xml:space="preserve">90,000円／月
-（年額 1,080,000円）</w:t>
+              <w:t xml:space="preserve">30,000円～／月
+（年額 360,000円～）</w:t>
             </w:r>
           </w:p>
         </w:tc>
@@ -1932,7 +1932,7 @@
                 <w:sz w:val="19"/>
                 <w:szCs w:val="19"/>
               </w:rPr>
-              <w:t xml:space="preserve">同（Premiumプラン）</w:t>
+              <w:t xml:space="preserve">初期費用・導入設定費</w:t>
             </w:r>
           </w:p>
         </w:tc>
@@ -1959,7 +1959,8 @@
                 <w:sz w:val="19"/>
                 <w:szCs w:val="19"/>
               </w:rPr>
-              <w:t xml:space="preserve">400円／ユーザー・月</w:t>
+              <w:t xml:space="preserve">0円
+（オプション追加時は別途見積り）</w:t>
             </w:r>
           </w:p>
         </w:tc>
@@ -1986,7 +1987,7 @@
                 <w:sz w:val="19"/>
                 <w:szCs w:val="19"/>
               </w:rPr>
-              <w:t xml:space="preserve">300名</w:t>
+              <w:t xml:space="preserve">―</w:t>
             </w:r>
           </w:p>
         </w:tc>
@@ -2013,119 +2014,7 @@
                 <w:sz w:val="19"/>
                 <w:szCs w:val="19"/>
               </w:rPr>
-              <w:t xml:space="preserve">120,000円／月
-（年額 1,440,000円）</w:t>
-            </w:r>
-          </w:p>
-        </w:tc>
-      </w:tr>
-      <w:tr>
-        <w:tc>
-          <w:tcPr>
-            <w:tcW w:type="dxa" w:w="2400"/>
-            <w:shd w:fill="F2F2F2" w:val="clear"/>
-            <w:tcMar>
-              <w:top w:type="dxa" w:w="80"/>
-              <w:left w:type="dxa" w:w="100"/>
-              <w:bottom w:type="dxa" w:w="80"/>
-              <w:right w:type="dxa" w:w="100"/>
-            </w:tcMar>
-            <w:vAlign w:val="center"/>
-          </w:tcPr>
-          <w:p>
-            <w:pPr>
-              <w:jc w:val="left"/>
-            </w:pPr>
-            <w:r>
-              <w:rPr>
-                <w:rFonts w:ascii="游ゴシック" w:cs="游ゴシック" w:eastAsia="游ゴシック" w:hAnsi="游ゴシック"/>
-                <w:b/>
-                <w:bCs/>
-                <w:sz w:val="19"/>
-                <w:szCs w:val="19"/>
-              </w:rPr>
-              <w:t xml:space="preserve">初期費用・導入設定費</w:t>
-            </w:r>
-          </w:p>
-        </w:tc>
-        <w:tc>
-          <w:tcPr>
-            <w:tcW w:type="dxa" w:w="2400"/>
-            <w:tcMar>
-              <w:top w:type="dxa" w:w="80"/>
-              <w:left w:type="dxa" w:w="100"/>
-              <w:bottom w:type="dxa" w:w="80"/>
-              <w:right w:type="dxa" w:w="100"/>
-            </w:tcMar>
-            <w:vAlign w:val="center"/>
-          </w:tcPr>
-          <w:p>
-            <w:pPr>
-              <w:jc w:val="center"/>
-            </w:pPr>
-            <w:r>
-              <w:rPr>
-                <w:rFonts w:ascii="游ゴシック" w:cs="游ゴシック" w:eastAsia="游ゴシック" w:hAnsi="游ゴシック"/>
-                <w:b w:val="false"/>
-                <w:bCs w:val="false"/>
-                <w:sz w:val="19"/>
-                <w:szCs w:val="19"/>
-              </w:rPr>
-              <w:t xml:space="preserve">個別見積り</w:t>
-            </w:r>
-          </w:p>
-        </w:tc>
-        <w:tc>
-          <w:tcPr>
-            <w:tcW w:type="dxa" w:w="2400"/>
-            <w:tcMar>
-              <w:top w:type="dxa" w:w="80"/>
-              <w:left w:type="dxa" w:w="100"/>
-              <w:bottom w:type="dxa" w:w="80"/>
-              <w:right w:type="dxa" w:w="100"/>
-            </w:tcMar>
-            <w:vAlign w:val="center"/>
-          </w:tcPr>
-          <w:p>
-            <w:pPr>
-              <w:jc w:val="center"/>
-            </w:pPr>
-            <w:r>
-              <w:rPr>
-                <w:rFonts w:ascii="游ゴシック" w:cs="游ゴシック" w:eastAsia="游ゴシック" w:hAnsi="游ゴシック"/>
-                <w:b w:val="false"/>
-                <w:bCs w:val="false"/>
-                <w:sz w:val="19"/>
-                <w:szCs w:val="19"/>
-              </w:rPr>
               <w:t xml:space="preserve">―</w:t>
-            </w:r>
-          </w:p>
-        </w:tc>
-        <w:tc>
-          <w:tcPr>
-            <w:tcW w:type="dxa" w:w="2126"/>
-            <w:tcMar>
-              <w:top w:type="dxa" w:w="80"/>
-              <w:left w:type="dxa" w:w="100"/>
-              <w:bottom w:type="dxa" w:w="80"/>
-              <w:right w:type="dxa" w:w="100"/>
-            </w:tcMar>
-            <w:vAlign w:val="center"/>
-          </w:tcPr>
-          <w:p>
-            <w:pPr>
-              <w:jc w:val="center"/>
-            </w:pPr>
-            <w:r>
-              <w:rPr>
-                <w:rFonts w:ascii="游ゴシック" w:cs="游ゴシック" w:eastAsia="游ゴシック" w:hAnsi="游ゴシック"/>
-                <w:b/>
-                <w:bCs/>
-                <w:sz w:val="19"/>
-                <w:szCs w:val="19"/>
-              </w:rPr>
-              <w:t xml:space="preserve">別途見積り取得予定</w:t>
             </w:r>
           </w:p>
         </w:tc>

</xml_diff>